<commit_message>
Update screenshots and submission doc with correct student name
</commit_message>
<xml_diff>
--- a/docs/StudentRegistrationWebApp_Auth_Assignment_Submission.docx
+++ b/docs/StudentRegistrationWebApp_Auth_Assignment_Submission.docx
@@ -999,6 +999,32 @@
           <w:szCs w:val="15"/>
         </w:rPr>
         <w:t xml:space="preserve">    &lt;RootNamespace&gt;StudentRegistrationWebApp&lt;/RootNamespace&gt;</w:t>
+      </w:r>
+    </w:p>
+    <w:p>
+      <w:pPr>
+        <w:spacing w:after="0" w:line="220"/>
+      </w:pPr>
+      <w:r>
+        <w:rPr>
+          <w:rFonts w:ascii="Consolas" w:cs="Consolas" w:eastAsia="Consolas" w:hAnsi="Consolas"/>
+          <w:sz w:val="15"/>
+          <w:szCs w:val="15"/>
+        </w:rPr>
+        <w:t xml:space="preserve">    &lt;!-- v1-event-management is a separate reference project; keep it out of this build --&gt;</w:t>
+      </w:r>
+    </w:p>
+    <w:p>
+      <w:pPr>
+        <w:spacing w:after="0" w:line="220"/>
+      </w:pPr>
+      <w:r>
+        <w:rPr>
+          <w:rFonts w:ascii="Consolas" w:cs="Consolas" w:eastAsia="Consolas" w:hAnsi="Consolas"/>
+          <w:sz w:val="15"/>
+          <w:szCs w:val="15"/>
+        </w:rPr>
+        <w:t xml:space="preserve">    &lt;DefaultItemExcludes&gt;$(DefaultItemExcludes);v1-event-management\**&lt;/DefaultItemExcludes&gt;</w:t>
       </w:r>
     </w:p>
     <w:p>

</xml_diff>